<commit_message>
Tuto nanoCAD Free : captures du site et de l'installateur, étapes recalées
Co-Authored-By: Claude Opus 5.5 <noreply@anthropic.com>
Claude-Session: https://claude.ai/code/session_01DGGfCD6qThzdifW5Zpbw8C
</commit_message>
<xml_diff>
--- a/docs/Tuto-nanoCAD-Free.docx
+++ b/docs/Tuto-nanoCAD-Free.docx
@@ -43,7 +43,7 @@
           <w:sz w:val="21"/>
           <w:szCs w:val="21"/>
         </w:rPr>
-        <w:t xml:space="preserve">nanoCAD Free (nanoCAD 5) est un logiciel de DAO gratuit qui ouvre et enregistre les fichiers .dwg. Il sert ici à consulter et modifier les plans de plomberie et le bloc du sous-compteur.</w:t>
+        <w:t xml:space="preserve">nanoCAD Free (nanoCAD 5) est un logiciel de DAO gratuit qui ouvre et enregistre les fichiers .dwg. Il sert ici à consulter et modifier les plans de plomberie et le bloc du sous-compteur. La licence Free est réservée à un usage non commercial.</w:t>
       </w:r>
     </w:p>
     <w:p>
@@ -59,7 +59,7 @@
           <w:sz w:val="28"/>
           <w:szCs w:val="28"/>
         </w:rPr>
-        <w:t xml:space="preserve">1. Créer un compte sur nanocad.com</w:t>
+        <w:t xml:space="preserve">1. Créer un compte et se connecter</w:t>
       </w:r>
     </w:p>
     <w:p>
@@ -84,14 +84,14 @@
           <w:sz w:val="21"/>
           <w:szCs w:val="21"/>
         </w:rPr>
-        <w:t xml:space="preserve">Aller sur la page de nanoCAD Free : </w:t>
-      </w:r>
-    </w:p>
-    <w:p>
-      <w:pPr>
-        <w:spacing w:after="100"/>
-      </w:pPr>
-      <w:hyperlink w:history="1" r:id="rIdhcjlzqgxjkwe0kpvzznlc">
+        <w:t xml:space="preserve">Aller sur la page de nanoCAD Free et cliquer sur « Télécharger gratuitement » :</w:t>
+      </w:r>
+    </w:p>
+    <w:p>
+      <w:pPr>
+        <w:spacing w:after="100"/>
+      </w:pPr>
+      <w:hyperlink w:history="1" r:id="rIdfler1fp_kx_tfbuptanm6">
         <w:r>
           <w:rPr>
             <w:rFonts w:ascii="Calibri" w:cs="Calibri" w:eastAsia="Calibri" w:hAnsi="Calibri"/>
@@ -104,49 +104,53 @@
         </w:r>
       </w:hyperlink>
     </w:p>
-    <w:tbl>
-      <w:tblPr>
-        <w:tblW w:type="dxa" w:w="9000"/>
-        <w:jc w:val="center"/>
-        <w:tblBorders>
-          <w:top w:val="dashed" w:color="9AA5AB" w:sz="6"/>
-          <w:left w:val="dashed" w:color="9AA5AB" w:sz="6"/>
-          <w:bottom w:val="dashed" w:color="9AA5AB" w:sz="6"/>
-          <w:right w:val="dashed" w:color="9AA5AB" w:sz="6"/>
-          <w:insideH w:val="single" w:color="auto" w:sz="4"/>
-          <w:insideV w:val="single" w:color="auto" w:sz="4"/>
-        </w:tblBorders>
-      </w:tblPr>
-      <w:tblGrid>
-        <w:gridCol w:w="9000"/>
-      </w:tblGrid>
-      <w:tr>
-        <w:trPr>
-          <w:trHeight w:val="1400"/>
-        </w:trPr>
-        <w:tc>
-          <w:tcPr>
-            <w:tcW w:type="dxa" w:w="9000"/>
-            <w:shd w:fill="EDF2F4" w:val="clear"/>
-            <w:vAlign w:val="center"/>
-          </w:tcPr>
-          <w:p>
-            <w:pPr>
-              <w:jc w:val="center"/>
-            </w:pPr>
-            <w:r>
-              <w:rPr>
-                <w:rFonts w:ascii="Calibri" w:cs="Calibri" w:eastAsia="Calibri" w:hAnsi="Calibri"/>
-                <w:color w:val="5B6770"/>
-                <w:sz w:val="20"/>
-                <w:szCs w:val="20"/>
-              </w:rPr>
-              <w:t xml:space="preserve">[ Image 1 à insérer ]</w:t>
-            </w:r>
-          </w:p>
-        </w:tc>
-      </w:tr>
-    </w:tbl>
+    <w:p>
+      <w:pPr>
+        <w:keepNext/>
+        <w:spacing w:after="40" w:before="80"/>
+        <w:jc w:val="center"/>
+      </w:pPr>
+      <w:r>
+        <w:drawing>
+          <wp:inline distT="0" distB="0" distL="0" distR="0">
+            <wp:extent cx="5334000" cy="2743200"/>
+            <wp:effectExtent t="0" r="0" b="0" l="0"/>
+            <wp:docPr id="1" name="" descr="" title=""/>
+            <wp:cNvGraphicFramePr>
+              <a:graphicFrameLocks xmlns:a="http://schemas.openxmlformats.org/drawingml/2006/main" noChangeAspect="1"/>
+            </wp:cNvGraphicFramePr>
+            <a:graphic xmlns:a="http://schemas.openxmlformats.org/drawingml/2006/main">
+              <a:graphicData uri="http://schemas.openxmlformats.org/drawingml/2006/picture">
+                <pic:pic xmlns:pic="http://schemas.openxmlformats.org/drawingml/2006/picture">
+                  <pic:nvPicPr>
+                    <pic:cNvPr id="0" name="" descr=""/>
+                    <pic:cNvPicPr>
+                      <a:picLocks noChangeAspect="1" noChangeArrowheads="1"/>
+                    </pic:cNvPicPr>
+                  </pic:nvPicPr>
+                  <pic:blipFill>
+                    <a:blip r:embed="rId7" cstate="none"/>
+                    <a:srcRect/>
+                    <a:stretch>
+                      <a:fillRect/>
+                    </a:stretch>
+                  </pic:blipFill>
+                  <pic:spPr bwMode="auto">
+                    <a:xfrm>
+                      <a:off x="0" y="0"/>
+                      <a:ext cx="5334000" cy="2743200"/>
+                    </a:xfrm>
+                    <a:prstGeom prst="rect">
+                      <a:avLst/>
+                    </a:prstGeom>
+                  </pic:spPr>
+                </pic:pic>
+              </a:graphicData>
+            </a:graphic>
+          </wp:inline>
+        </w:drawing>
+      </w:r>
+    </w:p>
     <w:p>
       <w:pPr>
         <w:spacing w:after="200"/>
@@ -161,7 +165,7 @@
           <w:sz w:val="18"/>
           <w:szCs w:val="18"/>
         </w:rPr>
-        <w:t xml:space="preserve">Image 1 : page de nanoCAD Free sur nanocad.com</w:t>
+        <w:t xml:space="preserve">Image 1 : page de nanoCAD Free, bouton « Télécharger gratuitement »</w:t>
       </w:r>
     </w:p>
     <w:p>
@@ -186,52 +190,56 @@
           <w:sz w:val="21"/>
           <w:szCs w:val="21"/>
         </w:rPr>
-        <w:t xml:space="preserve">Cliquer sur « Sign up » (ou « Log in » si un compte existe déjà) et remplir le formulaire.</w:t>
-      </w:r>
-    </w:p>
-    <w:tbl>
-      <w:tblPr>
-        <w:tblW w:type="dxa" w:w="9000"/>
-        <w:jc w:val="center"/>
-        <w:tblBorders>
-          <w:top w:val="dashed" w:color="9AA5AB" w:sz="6"/>
-          <w:left w:val="dashed" w:color="9AA5AB" w:sz="6"/>
-          <w:bottom w:val="dashed" w:color="9AA5AB" w:sz="6"/>
-          <w:right w:val="dashed" w:color="9AA5AB" w:sz="6"/>
-          <w:insideH w:val="single" w:color="auto" w:sz="4"/>
-          <w:insideV w:val="single" w:color="auto" w:sz="4"/>
-        </w:tblBorders>
-      </w:tblPr>
-      <w:tblGrid>
-        <w:gridCol w:w="9000"/>
-      </w:tblGrid>
-      <w:tr>
-        <w:trPr>
-          <w:trHeight w:val="1400"/>
-        </w:trPr>
-        <w:tc>
-          <w:tcPr>
-            <w:tcW w:type="dxa" w:w="9000"/>
-            <w:shd w:fill="EDF2F4" w:val="clear"/>
-            <w:vAlign w:val="center"/>
-          </w:tcPr>
-          <w:p>
-            <w:pPr>
-              <w:jc w:val="center"/>
-            </w:pPr>
-            <w:r>
-              <w:rPr>
-                <w:rFonts w:ascii="Calibri" w:cs="Calibri" w:eastAsia="Calibri" w:hAnsi="Calibri"/>
-                <w:color w:val="5B6770"/>
-                <w:sz w:val="20"/>
-                <w:szCs w:val="20"/>
-              </w:rPr>
-              <w:t xml:space="preserve">[ Image 2 à insérer ]</w:t>
-            </w:r>
-          </w:p>
-        </w:tc>
-      </w:tr>
-    </w:tbl>
+        <w:t xml:space="preserve">La page de connexion s'ouvre. Sans compte, cliquer sur « Create account » et remplir le formulaire, puis valider l'adresse e-mail avec le lien reçu. Ensuite, se connecter avec « Sign in ».</w:t>
+      </w:r>
+    </w:p>
+    <w:p>
+      <w:pPr>
+        <w:keepNext/>
+        <w:spacing w:after="40" w:before="80"/>
+        <w:jc w:val="center"/>
+      </w:pPr>
+      <w:r>
+        <w:drawing>
+          <wp:inline distT="0" distB="0" distL="0" distR="0">
+            <wp:extent cx="3238500" cy="2533650"/>
+            <wp:effectExtent t="0" r="0" b="0" l="0"/>
+            <wp:docPr id="1" name="" descr="" title=""/>
+            <wp:cNvGraphicFramePr>
+              <a:graphicFrameLocks xmlns:a="http://schemas.openxmlformats.org/drawingml/2006/main" noChangeAspect="1"/>
+            </wp:cNvGraphicFramePr>
+            <a:graphic xmlns:a="http://schemas.openxmlformats.org/drawingml/2006/main">
+              <a:graphicData uri="http://schemas.openxmlformats.org/drawingml/2006/picture">
+                <pic:pic xmlns:pic="http://schemas.openxmlformats.org/drawingml/2006/picture">
+                  <pic:nvPicPr>
+                    <pic:cNvPr id="0" name="" descr=""/>
+                    <pic:cNvPicPr>
+                      <a:picLocks noChangeAspect="1" noChangeArrowheads="1"/>
+                    </pic:cNvPicPr>
+                  </pic:nvPicPr>
+                  <pic:blipFill>
+                    <a:blip r:embed="rId8" cstate="none"/>
+                    <a:srcRect/>
+                    <a:stretch>
+                      <a:fillRect/>
+                    </a:stretch>
+                  </pic:blipFill>
+                  <pic:spPr bwMode="auto">
+                    <a:xfrm>
+                      <a:off x="0" y="0"/>
+                      <a:ext cx="3238500" cy="2533650"/>
+                    </a:xfrm>
+                    <a:prstGeom prst="rect">
+                      <a:avLst/>
+                    </a:prstGeom>
+                  </pic:spPr>
+                </pic:pic>
+              </a:graphicData>
+            </a:graphic>
+          </wp:inline>
+        </w:drawing>
+      </w:r>
+    </w:p>
     <w:p>
       <w:pPr>
         <w:spacing w:after="200"/>
@@ -246,32 +254,7 @@
           <w:sz w:val="18"/>
           <w:szCs w:val="18"/>
         </w:rPr>
-        <w:t xml:space="preserve">Image 2 : formulaire de création de compte</w:t>
-      </w:r>
-    </w:p>
-    <w:p>
-      <w:pPr>
-        <w:spacing w:after="100"/>
-      </w:pPr>
-      <w:r>
-        <w:rPr>
-          <w:rFonts w:ascii="Calibri" w:cs="Calibri" w:eastAsia="Calibri" w:hAnsi="Calibri"/>
-          <w:b/>
-          <w:bCs/>
-          <w:color w:val="0B5563"/>
-          <w:sz w:val="21"/>
-          <w:szCs w:val="21"/>
-        </w:rPr>
-        <w:t xml:space="preserve">3. </w:t>
-      </w:r>
-      <w:r>
-        <w:rPr>
-          <w:rFonts w:ascii="Calibri" w:cs="Calibri" w:eastAsia="Calibri" w:hAnsi="Calibri"/>
-          <w:color w:val="1F2933"/>
-          <w:sz w:val="21"/>
-          <w:szCs w:val="21"/>
-        </w:rPr>
-        <w:t xml:space="preserve">Valider l'adresse e-mail en cliquant sur le lien reçu, puis se connecter.</w:t>
+        <w:t xml:space="preserve">Image 2 : page de connexion (« Sign In » ou « Create account »)</w:t>
       </w:r>
     </w:p>
     <w:p>
@@ -287,77 +270,81 @@
           <w:sz w:val="28"/>
           <w:szCs w:val="28"/>
         </w:rPr>
-        <w:t xml:space="preserve">2. Obtenir le numéro de série</w:t>
-      </w:r>
-    </w:p>
-    <w:p>
-      <w:pPr>
-        <w:spacing w:after="100"/>
-      </w:pPr>
-      <w:r>
-        <w:rPr>
-          <w:rFonts w:ascii="Calibri" w:cs="Calibri" w:eastAsia="Calibri" w:hAnsi="Calibri"/>
-          <w:b/>
-          <w:bCs/>
-          <w:color w:val="0B5563"/>
-          <w:sz w:val="21"/>
-          <w:szCs w:val="21"/>
-        </w:rPr>
-        <w:t xml:space="preserve">4. </w:t>
-      </w:r>
-      <w:r>
-        <w:rPr>
-          <w:rFonts w:ascii="Calibri" w:cs="Calibri" w:eastAsia="Calibri" w:hAnsi="Calibri"/>
-          <w:color w:val="1F2933"/>
-          <w:sz w:val="21"/>
-          <w:szCs w:val="21"/>
-        </w:rPr>
-        <w:t xml:space="preserve">Ouvrir l'espace personnel (« My account », page nanocad.com/personal).</w:t>
-      </w:r>
-    </w:p>
-    <w:tbl>
-      <w:tblPr>
-        <w:tblW w:type="dxa" w:w="9000"/>
-        <w:jc w:val="center"/>
-        <w:tblBorders>
-          <w:top w:val="dashed" w:color="9AA5AB" w:sz="6"/>
-          <w:left w:val="dashed" w:color="9AA5AB" w:sz="6"/>
-          <w:bottom w:val="dashed" w:color="9AA5AB" w:sz="6"/>
-          <w:right w:val="dashed" w:color="9AA5AB" w:sz="6"/>
-          <w:insideH w:val="single" w:color="auto" w:sz="4"/>
-          <w:insideV w:val="single" w:color="auto" w:sz="4"/>
-        </w:tblBorders>
-      </w:tblPr>
-      <w:tblGrid>
-        <w:gridCol w:w="9000"/>
-      </w:tblGrid>
-      <w:tr>
-        <w:trPr>
-          <w:trHeight w:val="1400"/>
-        </w:trPr>
-        <w:tc>
-          <w:tcPr>
-            <w:tcW w:type="dxa" w:w="9000"/>
-            <w:shd w:fill="EDF2F4" w:val="clear"/>
-            <w:vAlign w:val="center"/>
-          </w:tcPr>
-          <w:p>
-            <w:pPr>
-              <w:jc w:val="center"/>
-            </w:pPr>
-            <w:r>
-              <w:rPr>
-                <w:rFonts w:ascii="Calibri" w:cs="Calibri" w:eastAsia="Calibri" w:hAnsi="Calibri"/>
-                <w:color w:val="5B6770"/>
-                <w:sz w:val="20"/>
-                <w:szCs w:val="20"/>
-              </w:rPr>
-              <w:t xml:space="preserve">[ Image 3 à insérer ]</w:t>
-            </w:r>
-          </w:p>
-        </w:tc>
-      </w:tr>
-    </w:tbl>
+        <w:t xml:space="preserve">2. Récupérer le numéro de série</w:t>
+      </w:r>
+    </w:p>
+    <w:p>
+      <w:pPr>
+        <w:spacing w:after="100"/>
+      </w:pPr>
+      <w:r>
+        <w:rPr>
+          <w:rFonts w:ascii="Calibri" w:cs="Calibri" w:eastAsia="Calibri" w:hAnsi="Calibri"/>
+          <w:b/>
+          <w:bCs/>
+          <w:color w:val="0B5563"/>
+          <w:sz w:val="21"/>
+          <w:szCs w:val="21"/>
+        </w:rPr>
+        <w:t xml:space="preserve">3. </w:t>
+      </w:r>
+      <w:r>
+        <w:rPr>
+          <w:rFonts w:ascii="Calibri" w:cs="Calibri" w:eastAsia="Calibri" w:hAnsi="Calibri"/>
+          <w:color w:val="1F2933"/>
+          <w:sz w:val="21"/>
+          <w:szCs w:val="21"/>
+        </w:rPr>
+        <w:t xml:space="preserve">Une fois connecté, l'espace personnel (« Personal account ») s'affiche. La carte verte « nanoCAD 5 Free » donne le numéro de série (il commence par NC5NVAS) et sa période de validité (un an, renouvelable gratuitement). Le noter. Le bouton « Details », en bas de page, affiche aussi la fiche de la licence.</w:t>
+      </w:r>
+    </w:p>
+    <w:p>
+      <w:pPr>
+        <w:keepNext/>
+        <w:spacing w:after="40" w:before="80"/>
+        <w:jc w:val="center"/>
+      </w:pPr>
+      <w:r>
+        <w:drawing>
+          <wp:inline distT="0" distB="0" distL="0" distR="0">
+            <wp:extent cx="5334000" cy="3076575"/>
+            <wp:effectExtent t="0" r="0" b="0" l="0"/>
+            <wp:docPr id="1" name="" descr="" title=""/>
+            <wp:cNvGraphicFramePr>
+              <a:graphicFrameLocks xmlns:a="http://schemas.openxmlformats.org/drawingml/2006/main" noChangeAspect="1"/>
+            </wp:cNvGraphicFramePr>
+            <a:graphic xmlns:a="http://schemas.openxmlformats.org/drawingml/2006/main">
+              <a:graphicData uri="http://schemas.openxmlformats.org/drawingml/2006/picture">
+                <pic:pic xmlns:pic="http://schemas.openxmlformats.org/drawingml/2006/picture">
+                  <pic:nvPicPr>
+                    <pic:cNvPr id="0" name="" descr=""/>
+                    <pic:cNvPicPr>
+                      <a:picLocks noChangeAspect="1" noChangeArrowheads="1"/>
+                    </pic:cNvPicPr>
+                  </pic:nvPicPr>
+                  <pic:blipFill>
+                    <a:blip r:embed="rId9" cstate="none"/>
+                    <a:srcRect/>
+                    <a:stretch>
+                      <a:fillRect/>
+                    </a:stretch>
+                  </pic:blipFill>
+                  <pic:spPr bwMode="auto">
+                    <a:xfrm>
+                      <a:off x="0" y="0"/>
+                      <a:ext cx="5334000" cy="3076575"/>
+                    </a:xfrm>
+                    <a:prstGeom prst="rect">
+                      <a:avLst/>
+                    </a:prstGeom>
+                  </pic:spPr>
+                </pic:pic>
+              </a:graphicData>
+            </a:graphic>
+          </wp:inline>
+        </w:drawing>
+      </w:r>
+    </w:p>
     <w:p>
       <w:pPr>
         <w:spacing w:after="200"/>
@@ -372,7 +359,48 @@
           <w:sz w:val="18"/>
           <w:szCs w:val="18"/>
         </w:rPr>
-        <w:t xml:space="preserve">Image 3 : espace personnel du compte</w:t>
+        <w:t xml:space="preserve">Image 3 : espace personnel, carte « nanoCAD 5 Free » (numéro de série flouté)</w:t>
+      </w:r>
+    </w:p>
+    <w:p>
+      <w:pPr>
+        <w:spacing w:after="100"/>
+      </w:pPr>
+      <w:r>
+        <w:rPr>
+          <w:rFonts w:ascii="Calibri" w:cs="Calibri" w:eastAsia="Calibri" w:hAnsi="Calibri"/>
+          <w:b/>
+          <w:bCs/>
+          <w:color w:val="0B5563"/>
+          <w:sz w:val="21"/>
+          <w:szCs w:val="21"/>
+        </w:rPr>
+        <w:t xml:space="preserve">4. </w:t>
+      </w:r>
+      <w:r>
+        <w:rPr>
+          <w:rFonts w:ascii="Calibri" w:cs="Calibri" w:eastAsia="Calibri" w:hAnsi="Calibri"/>
+          <w:color w:val="1F2933"/>
+          <w:sz w:val="21"/>
+          <w:szCs w:val="21"/>
+        </w:rPr>
+        <w:t xml:space="preserve">Cliquer sur « Download nanoCAD Free ».</w:t>
+      </w:r>
+    </w:p>
+    <w:p>
+      <w:pPr>
+        <w:spacing w:after="120" w:before="280"/>
+      </w:pPr>
+      <w:r>
+        <w:rPr>
+          <w:rFonts w:ascii="Calibri" w:cs="Calibri" w:eastAsia="Calibri" w:hAnsi="Calibri"/>
+          <w:b/>
+          <w:bCs/>
+          <w:color w:val="0B5563"/>
+          <w:sz w:val="28"/>
+          <w:szCs w:val="28"/>
+        </w:rPr>
+        <w:t xml:space="preserve">3. Télécharger et installer</w:t>
       </w:r>
     </w:p>
     <w:p>
@@ -397,52 +425,56 @@
           <w:sz w:val="21"/>
           <w:szCs w:val="21"/>
         </w:rPr>
-        <w:t xml:space="preserve">Choisir nanoCAD 5 Free et cliquer sur « Get serial number ».</w:t>
-      </w:r>
-    </w:p>
-    <w:tbl>
-      <w:tblPr>
-        <w:tblW w:type="dxa" w:w="9000"/>
-        <w:jc w:val="center"/>
-        <w:tblBorders>
-          <w:top w:val="dashed" w:color="9AA5AB" w:sz="6"/>
-          <w:left w:val="dashed" w:color="9AA5AB" w:sz="6"/>
-          <w:bottom w:val="dashed" w:color="9AA5AB" w:sz="6"/>
-          <w:right w:val="dashed" w:color="9AA5AB" w:sz="6"/>
-          <w:insideH w:val="single" w:color="auto" w:sz="4"/>
-          <w:insideV w:val="single" w:color="auto" w:sz="4"/>
-        </w:tblBorders>
-      </w:tblPr>
-      <w:tblGrid>
-        <w:gridCol w:w="9000"/>
-      </w:tblGrid>
-      <w:tr>
-        <w:trPr>
-          <w:trHeight w:val="1400"/>
-        </w:trPr>
-        <w:tc>
-          <w:tcPr>
-            <w:tcW w:type="dxa" w:w="9000"/>
-            <w:shd w:fill="EDF2F4" w:val="clear"/>
-            <w:vAlign w:val="center"/>
-          </w:tcPr>
-          <w:p>
-            <w:pPr>
-              <w:jc w:val="center"/>
-            </w:pPr>
-            <w:r>
-              <w:rPr>
-                <w:rFonts w:ascii="Calibri" w:cs="Calibri" w:eastAsia="Calibri" w:hAnsi="Calibri"/>
-                <w:color w:val="5B6770"/>
-                <w:sz w:val="20"/>
-                <w:szCs w:val="20"/>
-              </w:rPr>
-              <w:t xml:space="preserve">[ Image 4 à insérer ]</w:t>
-            </w:r>
-          </w:p>
-        </w:tc>
-      </w:tr>
-    </w:tbl>
+        <w:t xml:space="preserve">Sur la page de téléchargement, cliquer sur « Télécharger » en face de « X32 bit nanoCAD ver.5 » (fichier .exe d'environ 300 Mo).</w:t>
+      </w:r>
+    </w:p>
+    <w:p>
+      <w:pPr>
+        <w:keepNext/>
+        <w:spacing w:after="40" w:before="80"/>
+        <w:jc w:val="center"/>
+      </w:pPr>
+      <w:r>
+        <w:drawing>
+          <wp:inline distT="0" distB="0" distL="0" distR="0">
+            <wp:extent cx="5334000" cy="1733550"/>
+            <wp:effectExtent t="0" r="0" b="0" l="0"/>
+            <wp:docPr id="1" name="" descr="" title=""/>
+            <wp:cNvGraphicFramePr>
+              <a:graphicFrameLocks xmlns:a="http://schemas.openxmlformats.org/drawingml/2006/main" noChangeAspect="1"/>
+            </wp:cNvGraphicFramePr>
+            <a:graphic xmlns:a="http://schemas.openxmlformats.org/drawingml/2006/main">
+              <a:graphicData uri="http://schemas.openxmlformats.org/drawingml/2006/picture">
+                <pic:pic xmlns:pic="http://schemas.openxmlformats.org/drawingml/2006/picture">
+                  <pic:nvPicPr>
+                    <pic:cNvPr id="0" name="" descr=""/>
+                    <pic:cNvPicPr>
+                      <a:picLocks noChangeAspect="1" noChangeArrowheads="1"/>
+                    </pic:cNvPicPr>
+                  </pic:nvPicPr>
+                  <pic:blipFill>
+                    <a:blip r:embed="rId10" cstate="none"/>
+                    <a:srcRect/>
+                    <a:stretch>
+                      <a:fillRect/>
+                    </a:stretch>
+                  </pic:blipFill>
+                  <pic:spPr bwMode="auto">
+                    <a:xfrm>
+                      <a:off x="0" y="0"/>
+                      <a:ext cx="5334000" cy="1733550"/>
+                    </a:xfrm>
+                    <a:prstGeom prst="rect">
+                      <a:avLst/>
+                    </a:prstGeom>
+                  </pic:spPr>
+                </pic:pic>
+              </a:graphicData>
+            </a:graphic>
+          </wp:inline>
+        </w:drawing>
+      </w:r>
+    </w:p>
     <w:p>
       <w:pPr>
         <w:spacing w:after="200"/>
@@ -457,7 +489,7 @@
           <w:sz w:val="18"/>
           <w:szCs w:val="18"/>
         </w:rPr>
-        <w:t xml:space="preserve">Image 4 : bouton « Get serial number »</w:t>
+        <w:t xml:space="preserve">Image 4 : page de téléchargement de nanoCAD Free</w:t>
       </w:r>
     </w:p>
     <w:p>
@@ -482,52 +514,56 @@
           <w:sz w:val="21"/>
           <w:szCs w:val="21"/>
         </w:rPr>
-        <w:t xml:space="preserve">Noter le numéro de série affiché. Il commence par NC5NVAS et il est aussi envoyé par e-mail.</w:t>
-      </w:r>
-    </w:p>
-    <w:tbl>
-      <w:tblPr>
-        <w:tblW w:type="dxa" w:w="9000"/>
-        <w:jc w:val="center"/>
-        <w:tblBorders>
-          <w:top w:val="dashed" w:color="9AA5AB" w:sz="6"/>
-          <w:left w:val="dashed" w:color="9AA5AB" w:sz="6"/>
-          <w:bottom w:val="dashed" w:color="9AA5AB" w:sz="6"/>
-          <w:right w:val="dashed" w:color="9AA5AB" w:sz="6"/>
-          <w:insideH w:val="single" w:color="auto" w:sz="4"/>
-          <w:insideV w:val="single" w:color="auto" w:sz="4"/>
-        </w:tblBorders>
-      </w:tblPr>
-      <w:tblGrid>
-        <w:gridCol w:w="9000"/>
-      </w:tblGrid>
-      <w:tr>
-        <w:trPr>
-          <w:trHeight w:val="1400"/>
-        </w:trPr>
-        <w:tc>
-          <w:tcPr>
-            <w:tcW w:type="dxa" w:w="9000"/>
-            <w:shd w:fill="EDF2F4" w:val="clear"/>
-            <w:vAlign w:val="center"/>
-          </w:tcPr>
-          <w:p>
-            <w:pPr>
-              <w:jc w:val="center"/>
-            </w:pPr>
-            <w:r>
-              <w:rPr>
-                <w:rFonts w:ascii="Calibri" w:cs="Calibri" w:eastAsia="Calibri" w:hAnsi="Calibri"/>
-                <w:color w:val="5B6770"/>
-                <w:sz w:val="20"/>
-                <w:szCs w:val="20"/>
-              </w:rPr>
-              <w:t xml:space="preserve">[ Image 5 à insérer ]</w:t>
-            </w:r>
-          </w:p>
-        </w:tc>
-      </w:tr>
-    </w:tbl>
+        <w:t xml:space="preserve">Lancer le fichier téléchargé. L'assistant d'installation de nanoCAD 5.0 s'ouvre : cliquer sur « Suivant ».</w:t>
+      </w:r>
+    </w:p>
+    <w:p>
+      <w:pPr>
+        <w:keepNext/>
+        <w:spacing w:after="40" w:before="80"/>
+        <w:jc w:val="center"/>
+      </w:pPr>
+      <w:r>
+        <w:drawing>
+          <wp:inline distT="0" distB="0" distL="0" distR="0">
+            <wp:extent cx="3619500" cy="2867025"/>
+            <wp:effectExtent t="0" r="0" b="0" l="0"/>
+            <wp:docPr id="1" name="" descr="" title=""/>
+            <wp:cNvGraphicFramePr>
+              <a:graphicFrameLocks xmlns:a="http://schemas.openxmlformats.org/drawingml/2006/main" noChangeAspect="1"/>
+            </wp:cNvGraphicFramePr>
+            <a:graphic xmlns:a="http://schemas.openxmlformats.org/drawingml/2006/main">
+              <a:graphicData uri="http://schemas.openxmlformats.org/drawingml/2006/picture">
+                <pic:pic xmlns:pic="http://schemas.openxmlformats.org/drawingml/2006/picture">
+                  <pic:nvPicPr>
+                    <pic:cNvPr id="0" name="" descr=""/>
+                    <pic:cNvPicPr>
+                      <a:picLocks noChangeAspect="1" noChangeArrowheads="1"/>
+                    </pic:cNvPicPr>
+                  </pic:nvPicPr>
+                  <pic:blipFill>
+                    <a:blip r:embed="rId11" cstate="none"/>
+                    <a:srcRect/>
+                    <a:stretch>
+                      <a:fillRect/>
+                    </a:stretch>
+                  </pic:blipFill>
+                  <pic:spPr bwMode="auto">
+                    <a:xfrm>
+                      <a:off x="0" y="0"/>
+                      <a:ext cx="3619500" cy="2867025"/>
+                    </a:xfrm>
+                    <a:prstGeom prst="rect">
+                      <a:avLst/>
+                    </a:prstGeom>
+                  </pic:spPr>
+                </pic:pic>
+              </a:graphicData>
+            </a:graphic>
+          </wp:inline>
+        </w:drawing>
+      </w:r>
+    </w:p>
     <w:p>
       <w:pPr>
         <w:spacing w:after="200"/>
@@ -542,23 +578,7 @@
           <w:sz w:val="18"/>
           <w:szCs w:val="18"/>
         </w:rPr>
-        <w:t xml:space="preserve">Image 5 : numéro de série affiché (le flouter sur la capture)</w:t>
-      </w:r>
-    </w:p>
-    <w:p>
-      <w:pPr>
-        <w:spacing w:after="120" w:before="280"/>
-      </w:pPr>
-      <w:r>
-        <w:rPr>
-          <w:rFonts w:ascii="Calibri" w:cs="Calibri" w:eastAsia="Calibri" w:hAnsi="Calibri"/>
-          <w:b/>
-          <w:bCs/>
-          <w:color w:val="0B5563"/>
-          <w:sz w:val="28"/>
-          <w:szCs w:val="28"/>
-        </w:rPr>
-        <w:t xml:space="preserve">3. Télécharger et installer</w:t>
+        <w:t xml:space="preserve">Image 5 : accueil de l'assistant d'installation</w:t>
       </w:r>
     </w:p>
     <w:p>
@@ -583,7 +603,7 @@
           <w:sz w:val="21"/>
           <w:szCs w:val="21"/>
         </w:rPr>
-        <w:t xml:space="preserve">Cliquer sur « Download » et enregistrer l'installateur.</w:t>
+        <w:t xml:space="preserve">Accepter le contrat de licence, puis cliquer sur « Suivant ».</w:t>
       </w:r>
     </w:p>
     <w:tbl>
@@ -643,7 +663,7 @@
           <w:sz w:val="18"/>
           <w:szCs w:val="18"/>
         </w:rPr>
-        <w:t xml:space="preserve">Image 6 : bouton de téléchargement</w:t>
+        <w:t xml:space="preserve">Image 6 : contrat de licence</w:t>
       </w:r>
     </w:p>
     <w:p>
@@ -668,7 +688,7 @@
           <w:sz w:val="21"/>
           <w:szCs w:val="21"/>
         </w:rPr>
-        <w:t xml:space="preserve">Lancer l'installateur, choisir la langue et accepter le contrat de licence.</w:t>
+        <w:t xml:space="preserve">Saisir le numéro de série quand il est demandé.</w:t>
       </w:r>
     </w:p>
     <w:tbl>
@@ -728,7 +748,7 @@
           <w:sz w:val="18"/>
           <w:szCs w:val="18"/>
         </w:rPr>
-        <w:t xml:space="preserve">Image 7 : premier écran de l'installateur</w:t>
+        <w:t xml:space="preserve">Image 7 : écran de saisie du numéro de série</w:t>
       </w:r>
     </w:p>
     <w:p>
@@ -753,7 +773,7 @@
           <w:sz w:val="21"/>
           <w:szCs w:val="21"/>
         </w:rPr>
-        <w:t xml:space="preserve">Saisir le numéro de série quand il est demandé. Pour le saisir plus tard, décocher « I have serial number ».</w:t>
+        <w:t xml:space="preserve">Laisser le dossier d'installation par défaut, lancer l'installation, puis cliquer sur « Terminer ».</w:t>
       </w:r>
     </w:p>
     <w:tbl>
@@ -813,7 +833,23 @@
           <w:sz w:val="18"/>
           <w:szCs w:val="18"/>
         </w:rPr>
-        <w:t xml:space="preserve">Image 8 : écran de saisie du numéro de série</w:t>
+        <w:t xml:space="preserve">Image 8 : fin de l'installation</w:t>
+      </w:r>
+    </w:p>
+    <w:p>
+      <w:pPr>
+        <w:spacing w:after="120" w:before="280"/>
+      </w:pPr>
+      <w:r>
+        <w:rPr>
+          <w:rFonts w:ascii="Calibri" w:cs="Calibri" w:eastAsia="Calibri" w:hAnsi="Calibri"/>
+          <w:b/>
+          <w:bCs/>
+          <w:color w:val="0B5563"/>
+          <w:sz w:val="28"/>
+          <w:szCs w:val="28"/>
+        </w:rPr>
+        <w:t xml:space="preserve">4. Activer la licence</w:t>
       </w:r>
     </w:p>
     <w:p>
@@ -838,7 +874,7 @@
           <w:sz w:val="21"/>
           <w:szCs w:val="21"/>
         </w:rPr>
-        <w:t xml:space="preserve">Laisser le dossier d'installation par défaut, cliquer sur « Install », puis sur « Finish ».</w:t>
+        <w:t xml:space="preserve">Lancer nanoCAD. L'assistant d'enregistrement s'ouvre au premier démarrage.</w:t>
       </w:r>
     </w:p>
     <w:tbl>
@@ -898,23 +934,7 @@
           <w:sz w:val="18"/>
           <w:szCs w:val="18"/>
         </w:rPr>
-        <w:t xml:space="preserve">Image 9 : fin de l'installation</w:t>
-      </w:r>
-    </w:p>
-    <w:p>
-      <w:pPr>
-        <w:spacing w:after="120" w:before="280"/>
-      </w:pPr>
-      <w:r>
-        <w:rPr>
-          <w:rFonts w:ascii="Calibri" w:cs="Calibri" w:eastAsia="Calibri" w:hAnsi="Calibri"/>
-          <w:b/>
-          <w:bCs/>
-          <w:color w:val="0B5563"/>
-          <w:sz w:val="28"/>
-          <w:szCs w:val="28"/>
-        </w:rPr>
-        <w:t xml:space="preserve">4. Activer la licence</w:t>
+        <w:t xml:space="preserve">Image 9 : assistant d'enregistrement</w:t>
       </w:r>
     </w:p>
     <w:p>
@@ -939,7 +959,7 @@
           <w:sz w:val="21"/>
           <w:szCs w:val="21"/>
         </w:rPr>
-        <w:t xml:space="preserve">Lancer nanoCAD. L'assistant d'enregistrement (Registration Wizard) s'ouvre au premier démarrage.</w:t>
+        <w:t xml:space="preserve">Saisir le numéro de série si besoin, puis s'identifier avec l'adresse e-mail et le mot de passe du compte nanocad.com. L'assistant récupère la licence en ligne.</w:t>
       </w:r>
     </w:p>
     <w:tbl>
@@ -999,7 +1019,7 @@
           <w:sz w:val="18"/>
           <w:szCs w:val="18"/>
         </w:rPr>
-        <w:t xml:space="preserve">Image 10 : assistant d'enregistrement</w:t>
+        <w:t xml:space="preserve">Image 10 : fenêtre d'identification</w:t>
       </w:r>
     </w:p>
     <w:p>
@@ -1024,32 +1044,7 @@
           <w:sz w:val="21"/>
           <w:szCs w:val="21"/>
         </w:rPr>
-        <w:t xml:space="preserve">Saisir le numéro de série, puis cliquer sur « Next ».</w:t>
-      </w:r>
-    </w:p>
-    <w:p>
-      <w:pPr>
-        <w:spacing w:after="100"/>
-      </w:pPr>
-      <w:r>
-        <w:rPr>
-          <w:rFonts w:ascii="Calibri" w:cs="Calibri" w:eastAsia="Calibri" w:hAnsi="Calibri"/>
-          <w:b/>
-          <w:bCs/>
-          <w:color w:val="0B5563"/>
-          <w:sz w:val="21"/>
-          <w:szCs w:val="21"/>
-        </w:rPr>
-        <w:t xml:space="preserve">13. </w:t>
-      </w:r>
-      <w:r>
-        <w:rPr>
-          <w:rFonts w:ascii="Calibri" w:cs="Calibri" w:eastAsia="Calibri" w:hAnsi="Calibri"/>
-          <w:color w:val="1F2933"/>
-          <w:sz w:val="21"/>
-          <w:szCs w:val="21"/>
-        </w:rPr>
-        <w:t xml:space="preserve">S'identifier avec l'adresse e-mail et le mot de passe du compte nanocad.com. L'assistant récupère la licence en ligne.</w:t>
+        <w:t xml:space="preserve">Terminer l'assistant. Pour vérifier, ouvrir le menu Aide, puis « À propos ».</w:t>
       </w:r>
     </w:p>
     <w:tbl>
@@ -1109,117 +1104,7 @@
           <w:sz w:val="18"/>
           <w:szCs w:val="18"/>
         </w:rPr>
-        <w:t xml:space="preserve">Image 11 : fenêtre d'identification</w:t>
-      </w:r>
-    </w:p>
-    <w:p>
-      <w:pPr>
-        <w:spacing w:after="100"/>
-      </w:pPr>
-      <w:r>
-        <w:rPr>
-          <w:rFonts w:ascii="Calibri" w:cs="Calibri" w:eastAsia="Calibri" w:hAnsi="Calibri"/>
-          <w:b/>
-          <w:bCs/>
-          <w:color w:val="0B5563"/>
-          <w:sz w:val="21"/>
-          <w:szCs w:val="21"/>
-        </w:rPr>
-        <w:t xml:space="preserve">14. </w:t>
-      </w:r>
-      <w:r>
-        <w:rPr>
-          <w:rFonts w:ascii="Calibri" w:cs="Calibri" w:eastAsia="Calibri" w:hAnsi="Calibri"/>
-          <w:color w:val="1F2933"/>
-          <w:sz w:val="21"/>
-          <w:szCs w:val="21"/>
-        </w:rPr>
-        <w:t xml:space="preserve">Cliquer sur « Finish ». nanoCAD s'ouvre, licence active.</w:t>
-      </w:r>
-    </w:p>
-    <w:tbl>
-      <w:tblPr>
-        <w:tblW w:type="dxa" w:w="9000"/>
-        <w:jc w:val="center"/>
-        <w:tblBorders>
-          <w:top w:val="dashed" w:color="9AA5AB" w:sz="6"/>
-          <w:left w:val="dashed" w:color="9AA5AB" w:sz="6"/>
-          <w:bottom w:val="dashed" w:color="9AA5AB" w:sz="6"/>
-          <w:right w:val="dashed" w:color="9AA5AB" w:sz="6"/>
-          <w:insideH w:val="single" w:color="auto" w:sz="4"/>
-          <w:insideV w:val="single" w:color="auto" w:sz="4"/>
-        </w:tblBorders>
-      </w:tblPr>
-      <w:tblGrid>
-        <w:gridCol w:w="9000"/>
-      </w:tblGrid>
-      <w:tr>
-        <w:trPr>
-          <w:trHeight w:val="1400"/>
-        </w:trPr>
-        <w:tc>
-          <w:tcPr>
-            <w:tcW w:type="dxa" w:w="9000"/>
-            <w:shd w:fill="EDF2F4" w:val="clear"/>
-            <w:vAlign w:val="center"/>
-          </w:tcPr>
-          <w:p>
-            <w:pPr>
-              <w:jc w:val="center"/>
-            </w:pPr>
-            <w:r>
-              <w:rPr>
-                <w:rFonts w:ascii="Calibri" w:cs="Calibri" w:eastAsia="Calibri" w:hAnsi="Calibri"/>
-                <w:color w:val="5B6770"/>
-                <w:sz w:val="20"/>
-                <w:szCs w:val="20"/>
-              </w:rPr>
-              <w:t xml:space="preserve">[ Image 12 à insérer ]</w:t>
-            </w:r>
-          </w:p>
-        </w:tc>
-      </w:tr>
-    </w:tbl>
-    <w:p>
-      <w:pPr>
-        <w:spacing w:after="200"/>
-        <w:jc w:val="center"/>
-      </w:pPr>
-      <w:r>
-        <w:rPr>
-          <w:rFonts w:ascii="Calibri" w:cs="Calibri" w:eastAsia="Calibri" w:hAnsi="Calibri"/>
-          <w:i/>
-          <w:iCs/>
-          <w:color w:val="5B6770"/>
-          <w:sz w:val="18"/>
-          <w:szCs w:val="18"/>
-        </w:rPr>
-        <w:t xml:space="preserve">Image 12 : activation réussie</w:t>
-      </w:r>
-    </w:p>
-    <w:p>
-      <w:pPr>
-        <w:spacing w:after="100"/>
-      </w:pPr>
-      <w:r>
-        <w:rPr>
-          <w:rFonts w:ascii="Calibri" w:cs="Calibri" w:eastAsia="Calibri" w:hAnsi="Calibri"/>
-          <w:b/>
-          <w:bCs/>
-          <w:color w:val="0B5563"/>
-          <w:sz w:val="21"/>
-          <w:szCs w:val="21"/>
-        </w:rPr>
-        <w:t xml:space="preserve">15. </w:t>
-      </w:r>
-      <w:r>
-        <w:rPr>
-          <w:rFonts w:ascii="Calibri" w:cs="Calibri" w:eastAsia="Calibri" w:hAnsi="Calibri"/>
-          <w:color w:val="1F2933"/>
-          <w:sz w:val="21"/>
-          <w:szCs w:val="21"/>
-        </w:rPr>
-        <w:t xml:space="preserve">Vérifier : menu Aide, puis « À propos ». La licence est rangée dans C:\ProgramData\Nanosoft AS\RegWizard\Licenses.</w:t>
+        <w:t xml:space="preserve">Image 11 : licence active</w:t>
       </w:r>
     </w:p>
     <w:p>
@@ -1278,20 +1163,6 @@
           <w:szCs w:val="21"/>
         </w:rPr>
         <w:t xml:space="preserve">- Numéro de série perdu : il figure dans « My account » et dans l'e-mail reçu à la création.</w:t>
-      </w:r>
-    </w:p>
-    <w:p>
-      <w:pPr>
-        <w:spacing w:after="100"/>
-      </w:pPr>
-      <w:r>
-        <w:rPr>
-          <w:rFonts w:ascii="Calibri" w:cs="Calibri" w:eastAsia="Calibri" w:hAnsi="Calibri"/>
-          <w:color w:val="1F2933"/>
-          <w:sz w:val="21"/>
-          <w:szCs w:val="21"/>
-        </w:rPr>
-        <w:t xml:space="preserve">- Usage : vérifier les conditions de licence en vigueur sur le site (usage non commercial annoncé sur la page produit).</w:t>
       </w:r>
     </w:p>
     <w:p>

</xml_diff>

<commit_message>
Tuto nanoCAD Free : fin d'installation et activation rédigées en texte
Co-Authored-By: Claude Opus 5.5 <noreply@anthropic.com>
Claude-Session: https://claude.ai/code/session_01DGGfCD6qThzdifW5Zpbw8C
</commit_message>
<xml_diff>
--- a/docs/Tuto-nanoCAD-Free.docx
+++ b/docs/Tuto-nanoCAD-Free.docx
@@ -91,7 +91,7 @@
       <w:pPr>
         <w:spacing w:after="100"/>
       </w:pPr>
-      <w:hyperlink w:history="1" r:id="rIdfler1fp_kx_tfbuptanm6">
+      <w:hyperlink w:history="1" r:id="rIdl1hwn9b17ols3v3dpefuz">
         <w:r>
           <w:rPr>
             <w:rFonts w:ascii="Calibri" w:cs="Calibri" w:eastAsia="Calibri" w:hAnsi="Calibri"/>
@@ -113,7 +113,7 @@
       <w:r>
         <w:drawing>
           <wp:inline distT="0" distB="0" distL="0" distR="0">
-            <wp:extent cx="5334000" cy="2743200"/>
+            <wp:extent cx="4762500" cy="2447925"/>
             <wp:effectExtent t="0" r="0" b="0" l="0"/>
             <wp:docPr id="1" name="" descr="" title=""/>
             <wp:cNvGraphicFramePr>
@@ -138,7 +138,7 @@
                   <pic:spPr bwMode="auto">
                     <a:xfrm>
                       <a:off x="0" y="0"/>
-                      <a:ext cx="5334000" cy="2743200"/>
+                      <a:ext cx="4762500" cy="2447925"/>
                     </a:xfrm>
                     <a:prstGeom prst="rect">
                       <a:avLst/>
@@ -307,7 +307,7 @@
       <w:r>
         <w:drawing>
           <wp:inline distT="0" distB="0" distL="0" distR="0">
-            <wp:extent cx="5334000" cy="3076575"/>
+            <wp:extent cx="4762500" cy="2752725"/>
             <wp:effectExtent t="0" r="0" b="0" l="0"/>
             <wp:docPr id="1" name="" descr="" title=""/>
             <wp:cNvGraphicFramePr>
@@ -332,7 +332,7 @@
                   <pic:spPr bwMode="auto">
                     <a:xfrm>
                       <a:off x="0" y="0"/>
-                      <a:ext cx="5334000" cy="3076575"/>
+                      <a:ext cx="4762500" cy="2752725"/>
                     </a:xfrm>
                     <a:prstGeom prst="rect">
                       <a:avLst/>
@@ -437,7 +437,7 @@
       <w:r>
         <w:drawing>
           <wp:inline distT="0" distB="0" distL="0" distR="0">
-            <wp:extent cx="5334000" cy="1733550"/>
+            <wp:extent cx="4762500" cy="1552575"/>
             <wp:effectExtent t="0" r="0" b="0" l="0"/>
             <wp:docPr id="1" name="" descr="" title=""/>
             <wp:cNvGraphicFramePr>
@@ -462,7 +462,7 @@
                   <pic:spPr bwMode="auto">
                     <a:xfrm>
                       <a:off x="0" y="0"/>
-                      <a:ext cx="5334000" cy="1733550"/>
+                      <a:ext cx="4762500" cy="1552575"/>
                     </a:xfrm>
                     <a:prstGeom prst="rect">
                       <a:avLst/>
@@ -603,67 +603,7 @@
           <w:sz w:val="21"/>
           <w:szCs w:val="21"/>
         </w:rPr>
-        <w:t xml:space="preserve">Accepter le contrat de licence, puis cliquer sur « Suivant ».</w:t>
-      </w:r>
-    </w:p>
-    <w:tbl>
-      <w:tblPr>
-        <w:tblW w:type="dxa" w:w="9000"/>
-        <w:jc w:val="center"/>
-        <w:tblBorders>
-          <w:top w:val="dashed" w:color="9AA5AB" w:sz="6"/>
-          <w:left w:val="dashed" w:color="9AA5AB" w:sz="6"/>
-          <w:bottom w:val="dashed" w:color="9AA5AB" w:sz="6"/>
-          <w:right w:val="dashed" w:color="9AA5AB" w:sz="6"/>
-          <w:insideH w:val="single" w:color="auto" w:sz="4"/>
-          <w:insideV w:val="single" w:color="auto" w:sz="4"/>
-        </w:tblBorders>
-      </w:tblPr>
-      <w:tblGrid>
-        <w:gridCol w:w="9000"/>
-      </w:tblGrid>
-      <w:tr>
-        <w:trPr>
-          <w:trHeight w:val="1400"/>
-        </w:trPr>
-        <w:tc>
-          <w:tcPr>
-            <w:tcW w:type="dxa" w:w="9000"/>
-            <w:shd w:fill="EDF2F4" w:val="clear"/>
-            <w:vAlign w:val="center"/>
-          </w:tcPr>
-          <w:p>
-            <w:pPr>
-              <w:jc w:val="center"/>
-            </w:pPr>
-            <w:r>
-              <w:rPr>
-                <w:rFonts w:ascii="Calibri" w:cs="Calibri" w:eastAsia="Calibri" w:hAnsi="Calibri"/>
-                <w:color w:val="5B6770"/>
-                <w:sz w:val="20"/>
-                <w:szCs w:val="20"/>
-              </w:rPr>
-              <w:t xml:space="preserve">[ Image 6 à insérer ]</w:t>
-            </w:r>
-          </w:p>
-        </w:tc>
-      </w:tr>
-    </w:tbl>
-    <w:p>
-      <w:pPr>
-        <w:spacing w:after="200"/>
-        <w:jc w:val="center"/>
-      </w:pPr>
-      <w:r>
-        <w:rPr>
-          <w:rFonts w:ascii="Calibri" w:cs="Calibri" w:eastAsia="Calibri" w:hAnsi="Calibri"/>
-          <w:i/>
-          <w:iCs/>
-          <w:color w:val="5B6770"/>
-          <w:sz w:val="18"/>
-          <w:szCs w:val="18"/>
-        </w:rPr>
-        <w:t xml:space="preserve">Image 6 : contrat de licence</w:t>
+        <w:t xml:space="preserve">Fenêtre « Contrat de Licence d'Utilisateur Final » : cocher « J'accepte les termes de ce Contrat de Licence », puis cliquer sur « Suivant ».</w:t>
       </w:r>
     </w:p>
     <w:p>
@@ -688,67 +628,7 @@
           <w:sz w:val="21"/>
           <w:szCs w:val="21"/>
         </w:rPr>
-        <w:t xml:space="preserve">Saisir le numéro de série quand il est demandé.</w:t>
-      </w:r>
-    </w:p>
-    <w:tbl>
-      <w:tblPr>
-        <w:tblW w:type="dxa" w:w="9000"/>
-        <w:jc w:val="center"/>
-        <w:tblBorders>
-          <w:top w:val="dashed" w:color="9AA5AB" w:sz="6"/>
-          <w:left w:val="dashed" w:color="9AA5AB" w:sz="6"/>
-          <w:bottom w:val="dashed" w:color="9AA5AB" w:sz="6"/>
-          <w:right w:val="dashed" w:color="9AA5AB" w:sz="6"/>
-          <w:insideH w:val="single" w:color="auto" w:sz="4"/>
-          <w:insideV w:val="single" w:color="auto" w:sz="4"/>
-        </w:tblBorders>
-      </w:tblPr>
-      <w:tblGrid>
-        <w:gridCol w:w="9000"/>
-      </w:tblGrid>
-      <w:tr>
-        <w:trPr>
-          <w:trHeight w:val="1400"/>
-        </w:trPr>
-        <w:tc>
-          <w:tcPr>
-            <w:tcW w:type="dxa" w:w="9000"/>
-            <w:shd w:fill="EDF2F4" w:val="clear"/>
-            <w:vAlign w:val="center"/>
-          </w:tcPr>
-          <w:p>
-            <w:pPr>
-              <w:jc w:val="center"/>
-            </w:pPr>
-            <w:r>
-              <w:rPr>
-                <w:rFonts w:ascii="Calibri" w:cs="Calibri" w:eastAsia="Calibri" w:hAnsi="Calibri"/>
-                <w:color w:val="5B6770"/>
-                <w:sz w:val="20"/>
-                <w:szCs w:val="20"/>
-              </w:rPr>
-              <w:t xml:space="preserve">[ Image 7 à insérer ]</w:t>
-            </w:r>
-          </w:p>
-        </w:tc>
-      </w:tr>
-    </w:tbl>
-    <w:p>
-      <w:pPr>
-        <w:spacing w:after="200"/>
-        <w:jc w:val="center"/>
-      </w:pPr>
-      <w:r>
-        <w:rPr>
-          <w:rFonts w:ascii="Calibri" w:cs="Calibri" w:eastAsia="Calibri" w:hAnsi="Calibri"/>
-          <w:i/>
-          <w:iCs/>
-          <w:color w:val="5B6770"/>
-          <w:sz w:val="18"/>
-          <w:szCs w:val="18"/>
-        </w:rPr>
-        <w:t xml:space="preserve">Image 7 : écran de saisie du numéro de série</w:t>
+        <w:t xml:space="preserve">Si l'installateur demande le numéro de série, copier celui de la carte « nanoCAD 5 Free » de l'espace personnel (format NC5NVAS-…). S'il ne le demande pas, il sera saisi à l'activation (partie 4).</w:t>
       </w:r>
     </w:p>
     <w:p>
@@ -773,67 +653,32 @@
           <w:sz w:val="21"/>
           <w:szCs w:val="21"/>
         </w:rPr>
-        <w:t xml:space="preserve">Laisser le dossier d'installation par défaut, lancer l'installation, puis cliquer sur « Terminer ».</w:t>
-      </w:r>
-    </w:p>
-    <w:tbl>
-      <w:tblPr>
-        <w:tblW w:type="dxa" w:w="9000"/>
-        <w:jc w:val="center"/>
-        <w:tblBorders>
-          <w:top w:val="dashed" w:color="9AA5AB" w:sz="6"/>
-          <w:left w:val="dashed" w:color="9AA5AB" w:sz="6"/>
-          <w:bottom w:val="dashed" w:color="9AA5AB" w:sz="6"/>
-          <w:right w:val="dashed" w:color="9AA5AB" w:sz="6"/>
-          <w:insideH w:val="single" w:color="auto" w:sz="4"/>
-          <w:insideV w:val="single" w:color="auto" w:sz="4"/>
-        </w:tblBorders>
-      </w:tblPr>
-      <w:tblGrid>
-        <w:gridCol w:w="9000"/>
-      </w:tblGrid>
-      <w:tr>
-        <w:trPr>
-          <w:trHeight w:val="1400"/>
-        </w:trPr>
-        <w:tc>
-          <w:tcPr>
-            <w:tcW w:type="dxa" w:w="9000"/>
-            <w:shd w:fill="EDF2F4" w:val="clear"/>
-            <w:vAlign w:val="center"/>
-          </w:tcPr>
-          <w:p>
-            <w:pPr>
-              <w:jc w:val="center"/>
-            </w:pPr>
-            <w:r>
-              <w:rPr>
-                <w:rFonts w:ascii="Calibri" w:cs="Calibri" w:eastAsia="Calibri" w:hAnsi="Calibri"/>
-                <w:color w:val="5B6770"/>
-                <w:sz w:val="20"/>
-                <w:szCs w:val="20"/>
-              </w:rPr>
-              <w:t xml:space="preserve">[ Image 8 à insérer ]</w:t>
-            </w:r>
-          </w:p>
-        </w:tc>
-      </w:tr>
-    </w:tbl>
-    <w:p>
-      <w:pPr>
-        <w:spacing w:after="200"/>
-        <w:jc w:val="center"/>
-      </w:pPr>
-      <w:r>
-        <w:rPr>
-          <w:rFonts w:ascii="Calibri" w:cs="Calibri" w:eastAsia="Calibri" w:hAnsi="Calibri"/>
-          <w:i/>
-          <w:iCs/>
-          <w:color w:val="5B6770"/>
-          <w:sz w:val="18"/>
-          <w:szCs w:val="18"/>
-        </w:rPr>
-        <w:t xml:space="preserve">Image 8 : fin de l'installation</w:t>
+        <w:t xml:space="preserve">Laisser le dossier d'installation proposé par défaut et cliquer sur « Suivant », puis sur « Installer ». Windows peut demander d'autoriser l'application à modifier l'ordinateur : répondre « Oui ».</w:t>
+      </w:r>
+    </w:p>
+    <w:p>
+      <w:pPr>
+        <w:spacing w:after="100"/>
+      </w:pPr>
+      <w:r>
+        <w:rPr>
+          <w:rFonts w:ascii="Calibri" w:cs="Calibri" w:eastAsia="Calibri" w:hAnsi="Calibri"/>
+          <w:b/>
+          <w:bCs/>
+          <w:color w:val="0B5563"/>
+          <w:sz w:val="21"/>
+          <w:szCs w:val="21"/>
+        </w:rPr>
+        <w:t xml:space="preserve">10. </w:t>
+      </w:r>
+      <w:r>
+        <w:rPr>
+          <w:rFonts w:ascii="Calibri" w:cs="Calibri" w:eastAsia="Calibri" w:hAnsi="Calibri"/>
+          <w:color w:val="1F2933"/>
+          <w:sz w:val="21"/>
+          <w:szCs w:val="21"/>
+        </w:rPr>
+        <w:t xml:space="preserve">Attendre la fin de la copie des fichiers (quelques minutes), puis cliquer sur « Terminer ». Un raccourci nanoCAD est créé sur le bureau et dans le menu Démarrer.</w:t>
       </w:r>
     </w:p>
     <w:p>
@@ -865,91 +710,6 @@
           <w:sz w:val="21"/>
           <w:szCs w:val="21"/>
         </w:rPr>
-        <w:t xml:space="preserve">10. </w:t>
-      </w:r>
-      <w:r>
-        <w:rPr>
-          <w:rFonts w:ascii="Calibri" w:cs="Calibri" w:eastAsia="Calibri" w:hAnsi="Calibri"/>
-          <w:color w:val="1F2933"/>
-          <w:sz w:val="21"/>
-          <w:szCs w:val="21"/>
-        </w:rPr>
-        <w:t xml:space="preserve">Lancer nanoCAD. L'assistant d'enregistrement s'ouvre au premier démarrage.</w:t>
-      </w:r>
-    </w:p>
-    <w:tbl>
-      <w:tblPr>
-        <w:tblW w:type="dxa" w:w="9000"/>
-        <w:jc w:val="center"/>
-        <w:tblBorders>
-          <w:top w:val="dashed" w:color="9AA5AB" w:sz="6"/>
-          <w:left w:val="dashed" w:color="9AA5AB" w:sz="6"/>
-          <w:bottom w:val="dashed" w:color="9AA5AB" w:sz="6"/>
-          <w:right w:val="dashed" w:color="9AA5AB" w:sz="6"/>
-          <w:insideH w:val="single" w:color="auto" w:sz="4"/>
-          <w:insideV w:val="single" w:color="auto" w:sz="4"/>
-        </w:tblBorders>
-      </w:tblPr>
-      <w:tblGrid>
-        <w:gridCol w:w="9000"/>
-      </w:tblGrid>
-      <w:tr>
-        <w:trPr>
-          <w:trHeight w:val="1400"/>
-        </w:trPr>
-        <w:tc>
-          <w:tcPr>
-            <w:tcW w:type="dxa" w:w="9000"/>
-            <w:shd w:fill="EDF2F4" w:val="clear"/>
-            <w:vAlign w:val="center"/>
-          </w:tcPr>
-          <w:p>
-            <w:pPr>
-              <w:jc w:val="center"/>
-            </w:pPr>
-            <w:r>
-              <w:rPr>
-                <w:rFonts w:ascii="Calibri" w:cs="Calibri" w:eastAsia="Calibri" w:hAnsi="Calibri"/>
-                <w:color w:val="5B6770"/>
-                <w:sz w:val="20"/>
-                <w:szCs w:val="20"/>
-              </w:rPr>
-              <w:t xml:space="preserve">[ Image 9 à insérer ]</w:t>
-            </w:r>
-          </w:p>
-        </w:tc>
-      </w:tr>
-    </w:tbl>
-    <w:p>
-      <w:pPr>
-        <w:spacing w:after="200"/>
-        <w:jc w:val="center"/>
-      </w:pPr>
-      <w:r>
-        <w:rPr>
-          <w:rFonts w:ascii="Calibri" w:cs="Calibri" w:eastAsia="Calibri" w:hAnsi="Calibri"/>
-          <w:i/>
-          <w:iCs/>
-          <w:color w:val="5B6770"/>
-          <w:sz w:val="18"/>
-          <w:szCs w:val="18"/>
-        </w:rPr>
-        <w:t xml:space="preserve">Image 9 : assistant d'enregistrement</w:t>
-      </w:r>
-    </w:p>
-    <w:p>
-      <w:pPr>
-        <w:spacing w:after="100"/>
-      </w:pPr>
-      <w:r>
-        <w:rPr>
-          <w:rFonts w:ascii="Calibri" w:cs="Calibri" w:eastAsia="Calibri" w:hAnsi="Calibri"/>
-          <w:b/>
-          <w:bCs/>
-          <w:color w:val="0B5563"/>
-          <w:sz w:val="21"/>
-          <w:szCs w:val="21"/>
-        </w:rPr>
         <w:t xml:space="preserve">11. </w:t>
       </w:r>
       <w:r>
@@ -959,67 +719,7 @@
           <w:sz w:val="21"/>
           <w:szCs w:val="21"/>
         </w:rPr>
-        <w:t xml:space="preserve">Saisir le numéro de série si besoin, puis s'identifier avec l'adresse e-mail et le mot de passe du compte nanocad.com. L'assistant récupère la licence en ligne.</w:t>
-      </w:r>
-    </w:p>
-    <w:tbl>
-      <w:tblPr>
-        <w:tblW w:type="dxa" w:w="9000"/>
-        <w:jc w:val="center"/>
-        <w:tblBorders>
-          <w:top w:val="dashed" w:color="9AA5AB" w:sz="6"/>
-          <w:left w:val="dashed" w:color="9AA5AB" w:sz="6"/>
-          <w:bottom w:val="dashed" w:color="9AA5AB" w:sz="6"/>
-          <w:right w:val="dashed" w:color="9AA5AB" w:sz="6"/>
-          <w:insideH w:val="single" w:color="auto" w:sz="4"/>
-          <w:insideV w:val="single" w:color="auto" w:sz="4"/>
-        </w:tblBorders>
-      </w:tblPr>
-      <w:tblGrid>
-        <w:gridCol w:w="9000"/>
-      </w:tblGrid>
-      <w:tr>
-        <w:trPr>
-          <w:trHeight w:val="1400"/>
-        </w:trPr>
-        <w:tc>
-          <w:tcPr>
-            <w:tcW w:type="dxa" w:w="9000"/>
-            <w:shd w:fill="EDF2F4" w:val="clear"/>
-            <w:vAlign w:val="center"/>
-          </w:tcPr>
-          <w:p>
-            <w:pPr>
-              <w:jc w:val="center"/>
-            </w:pPr>
-            <w:r>
-              <w:rPr>
-                <w:rFonts w:ascii="Calibri" w:cs="Calibri" w:eastAsia="Calibri" w:hAnsi="Calibri"/>
-                <w:color w:val="5B6770"/>
-                <w:sz w:val="20"/>
-                <w:szCs w:val="20"/>
-              </w:rPr>
-              <w:t xml:space="preserve">[ Image 10 à insérer ]</w:t>
-            </w:r>
-          </w:p>
-        </w:tc>
-      </w:tr>
-    </w:tbl>
-    <w:p>
-      <w:pPr>
-        <w:spacing w:after="200"/>
-        <w:jc w:val="center"/>
-      </w:pPr>
-      <w:r>
-        <w:rPr>
-          <w:rFonts w:ascii="Calibri" w:cs="Calibri" w:eastAsia="Calibri" w:hAnsi="Calibri"/>
-          <w:i/>
-          <w:iCs/>
-          <w:color w:val="5B6770"/>
-          <w:sz w:val="18"/>
-          <w:szCs w:val="18"/>
-        </w:rPr>
-        <w:t xml:space="preserve">Image 10 : fenêtre d'identification</w:t>
+        <w:t xml:space="preserve">Lancer nanoCAD. Au premier démarrage, l'assistant d'enregistrement s'ouvre. S'il ne s'ouvre pas, le lancer depuis le menu Démarrer (dossier Nanosoft) ou depuis le menu Aide de nanoCAD.</w:t>
       </w:r>
     </w:p>
     <w:p>
@@ -1044,67 +744,107 @@
           <w:sz w:val="21"/>
           <w:szCs w:val="21"/>
         </w:rPr>
-        <w:t xml:space="preserve">Terminer l'assistant. Pour vérifier, ouvrir le menu Aide, puis « À propos ».</w:t>
-      </w:r>
-    </w:p>
-    <w:tbl>
-      <w:tblPr>
-        <w:tblW w:type="dxa" w:w="9000"/>
-        <w:jc w:val="center"/>
-        <w:tblBorders>
-          <w:top w:val="dashed" w:color="9AA5AB" w:sz="6"/>
-          <w:left w:val="dashed" w:color="9AA5AB" w:sz="6"/>
-          <w:bottom w:val="dashed" w:color="9AA5AB" w:sz="6"/>
-          <w:right w:val="dashed" w:color="9AA5AB" w:sz="6"/>
-          <w:insideH w:val="single" w:color="auto" w:sz="4"/>
-          <w:insideV w:val="single" w:color="auto" w:sz="4"/>
-        </w:tblBorders>
-      </w:tblPr>
-      <w:tblGrid>
-        <w:gridCol w:w="9000"/>
-      </w:tblGrid>
-      <w:tr>
-        <w:trPr>
-          <w:trHeight w:val="1400"/>
-        </w:trPr>
-        <w:tc>
-          <w:tcPr>
-            <w:tcW w:type="dxa" w:w="9000"/>
-            <w:shd w:fill="EDF2F4" w:val="clear"/>
-            <w:vAlign w:val="center"/>
-          </w:tcPr>
-          <w:p>
-            <w:pPr>
-              <w:jc w:val="center"/>
-            </w:pPr>
-            <w:r>
-              <w:rPr>
-                <w:rFonts w:ascii="Calibri" w:cs="Calibri" w:eastAsia="Calibri" w:hAnsi="Calibri"/>
-                <w:color w:val="5B6770"/>
-                <w:sz w:val="20"/>
-                <w:szCs w:val="20"/>
-              </w:rPr>
-              <w:t xml:space="preserve">[ Image 11 à insérer ]</w:t>
-            </w:r>
-          </w:p>
-        </w:tc>
-      </w:tr>
-    </w:tbl>
-    <w:p>
-      <w:pPr>
-        <w:spacing w:after="200"/>
-        <w:jc w:val="center"/>
-      </w:pPr>
-      <w:r>
-        <w:rPr>
-          <w:rFonts w:ascii="Calibri" w:cs="Calibri" w:eastAsia="Calibri" w:hAnsi="Calibri"/>
-          <w:i/>
-          <w:iCs/>
-          <w:color w:val="5B6770"/>
-          <w:sz w:val="18"/>
-          <w:szCs w:val="18"/>
-        </w:rPr>
-        <w:t xml:space="preserve">Image 11 : licence active</w:t>
+        <w:t xml:space="preserve">Choisir l'option qui demande une licence avec le numéro de série, coller le numéro de série, puis cliquer sur « Suivant ».</w:t>
+      </w:r>
+    </w:p>
+    <w:p>
+      <w:pPr>
+        <w:spacing w:after="100"/>
+      </w:pPr>
+      <w:r>
+        <w:rPr>
+          <w:rFonts w:ascii="Calibri" w:cs="Calibri" w:eastAsia="Calibri" w:hAnsi="Calibri"/>
+          <w:b/>
+          <w:bCs/>
+          <w:color w:val="0B5563"/>
+          <w:sz w:val="21"/>
+          <w:szCs w:val="21"/>
+        </w:rPr>
+        <w:t xml:space="preserve">13. </w:t>
+      </w:r>
+      <w:r>
+        <w:rPr>
+          <w:rFonts w:ascii="Calibri" w:cs="Calibri" w:eastAsia="Calibri" w:hAnsi="Calibri"/>
+          <w:color w:val="1F2933"/>
+          <w:sz w:val="21"/>
+          <w:szCs w:val="21"/>
+        </w:rPr>
+        <w:t xml:space="preserve">S'identifier avec l'adresse e-mail et le mot de passe du compte nanocad.com (les mêmes qu'à l'étape 2). L'assistant se connecte au serveur nanoCAD, récupère la licence et l'installe automatiquement.</w:t>
+      </w:r>
+    </w:p>
+    <w:p>
+      <w:pPr>
+        <w:spacing w:after="100"/>
+      </w:pPr>
+      <w:r>
+        <w:rPr>
+          <w:rFonts w:ascii="Calibri" w:cs="Calibri" w:eastAsia="Calibri" w:hAnsi="Calibri"/>
+          <w:b/>
+          <w:bCs/>
+          <w:color w:val="0B5563"/>
+          <w:sz w:val="21"/>
+          <w:szCs w:val="21"/>
+        </w:rPr>
+        <w:t xml:space="preserve">14. </w:t>
+      </w:r>
+      <w:r>
+        <w:rPr>
+          <w:rFonts w:ascii="Calibri" w:cs="Calibri" w:eastAsia="Calibri" w:hAnsi="Calibri"/>
+          <w:color w:val="1F2933"/>
+          <w:sz w:val="21"/>
+          <w:szCs w:val="21"/>
+        </w:rPr>
+        <w:t xml:space="preserve">Cliquer sur « Terminer ». nanoCAD s'ouvre avec la licence active.</w:t>
+      </w:r>
+    </w:p>
+    <w:p>
+      <w:pPr>
+        <w:spacing w:after="100"/>
+      </w:pPr>
+      <w:r>
+        <w:rPr>
+          <w:rFonts w:ascii="Calibri" w:cs="Calibri" w:eastAsia="Calibri" w:hAnsi="Calibri"/>
+          <w:b/>
+          <w:bCs/>
+          <w:color w:val="0B5563"/>
+          <w:sz w:val="21"/>
+          <w:szCs w:val="21"/>
+        </w:rPr>
+        <w:t xml:space="preserve">15. </w:t>
+      </w:r>
+      <w:r>
+        <w:rPr>
+          <w:rFonts w:ascii="Calibri" w:cs="Calibri" w:eastAsia="Calibri" w:hAnsi="Calibri"/>
+          <w:color w:val="1F2933"/>
+          <w:sz w:val="21"/>
+          <w:szCs w:val="21"/>
+        </w:rPr>
+        <w:t xml:space="preserve">Pour vérifier : menu Aide, puis « À propos ». Le fichier de licence est enregistré dans C:\ProgramData\Nanosoft AS\RegWizard\Licenses.</w:t>
+      </w:r>
+    </w:p>
+    <w:p>
+      <w:pPr>
+        <w:spacing w:after="100"/>
+      </w:pPr>
+      <w:r>
+        <w:rPr>
+          <w:rFonts w:ascii="Calibri" w:cs="Calibri" w:eastAsia="Calibri" w:hAnsi="Calibri"/>
+          <w:b/>
+          <w:bCs/>
+          <w:color w:val="0B5563"/>
+          <w:sz w:val="21"/>
+          <w:szCs w:val="21"/>
+        </w:rPr>
+        <w:t xml:space="preserve">16. </w:t>
+      </w:r>
+      <w:r>
+        <w:rPr>
+          <w:rFonts w:ascii="Calibri" w:cs="Calibri" w:eastAsia="Calibri" w:hAnsi="Calibri"/>
+          <w:color w:val="1F2933"/>
+          <w:sz w:val="21"/>
+          <w:szCs w:val="21"/>
+        </w:rPr>
+        <w:t xml:space="preserve">La licence est valable un an. À l'échéance, la renouveler gratuitement depuis l'espace personnel, puis relancer l'assistant d'enregistrement.</w:t>
       </w:r>
     </w:p>
     <w:p>
@@ -1148,21 +888,21 @@
           <w:sz w:val="21"/>
           <w:szCs w:val="21"/>
         </w:rPr>
-        <w:t xml:space="preserve">- Une licence Free ne s'active que sur un seul ordinateur. Chaque membre du binôme crée son propre numéro de série.</w:t>
-      </w:r>
-    </w:p>
-    <w:p>
-      <w:pPr>
-        <w:spacing w:after="100"/>
-      </w:pPr>
-      <w:r>
-        <w:rPr>
-          <w:rFonts w:ascii="Calibri" w:cs="Calibri" w:eastAsia="Calibri" w:hAnsi="Calibri"/>
-          <w:color w:val="1F2933"/>
-          <w:sz w:val="21"/>
-          <w:szCs w:val="21"/>
-        </w:rPr>
-        <w:t xml:space="preserve">- Numéro de série perdu : il figure dans « My account » et dans l'e-mail reçu à la création.</w:t>
+        <w:t xml:space="preserve">- Un numéro de série couvre le nombre de postes indiqué sur la carte (« Number of licenses »). Au-delà, chacun crée son propre compte et son propre numéro de série.</w:t>
+      </w:r>
+    </w:p>
+    <w:p>
+      <w:pPr>
+        <w:spacing w:after="100"/>
+      </w:pPr>
+      <w:r>
+        <w:rPr>
+          <w:rFonts w:ascii="Calibri" w:cs="Calibri" w:eastAsia="Calibri" w:hAnsi="Calibri"/>
+          <w:color w:val="1F2933"/>
+          <w:sz w:val="21"/>
+          <w:szCs w:val="21"/>
+        </w:rPr>
+        <w:t xml:space="preserve">- Numéro de série perdu : il figure dans l'espace personnel (bouton « Details ») et dans l'e-mail reçu à la création.</w:t>
       </w:r>
     </w:p>
     <w:p>
@@ -1178,21 +918,21 @@
           <w:sz w:val="28"/>
           <w:szCs w:val="28"/>
         </w:rPr>
-        <w:t xml:space="preserve">6. Ouvrir le bloc du sous-compteur</w:t>
-      </w:r>
-    </w:p>
-    <w:p>
-      <w:pPr>
-        <w:spacing w:after="100"/>
-      </w:pPr>
-      <w:r>
-        <w:rPr>
-          <w:rFonts w:ascii="Calibri" w:cs="Calibri" w:eastAsia="Calibri" w:hAnsi="Calibri"/>
-          <w:color w:val="1F2933"/>
-          <w:sz w:val="21"/>
-          <w:szCs w:val="21"/>
-        </w:rPr>
-        <w:t xml:space="preserve">Ouvrir plans/sous-compteur.dwg (ou le .dxf) avec Fichier, Ouvrir. Pour l'insérer dans un plan : commande INSERER, puis Parcourir. nanoCAD demande alors REPERE, DN et ZONE.</w:t>
+        <w:t xml:space="preserve">6. Ouvrir les plans</w:t>
+      </w:r>
+    </w:p>
+    <w:p>
+      <w:pPr>
+        <w:spacing w:after="100"/>
+      </w:pPr>
+      <w:r>
+        <w:rPr>
+          <w:rFonts w:ascii="Calibri" w:cs="Calibri" w:eastAsia="Calibri" w:hAnsi="Calibri"/>
+          <w:color w:val="1F2933"/>
+          <w:sz w:val="21"/>
+          <w:szCs w:val="21"/>
+        </w:rPr>
+        <w:t xml:space="preserve">Dans nanoCAD : Fichier, puis Ouvrir, et choisir le plan .dwg de l'ECAM.</w:t>
       </w:r>
     </w:p>
     <w:sectPr>

</xml_diff>